<commit_message>
Amend Plan Rev8 and Guide v5: Sylph abundance diagnostic, reads versus DNA mass
</commit_message>
<xml_diff>
--- a/docs/Nanopore_Metagenomics_Project_Plan_Rev8.docx
+++ b/docs/Nanopore_Metagenomics_Project_Plan_Rev8.docx
@@ -25,7 +25,7 @@
     </w:p>
     <w:p>
       <w:r>
-        <w:t>Working draft, revision 8 • 18 October 2026 • Independent portfolio project</w:t>
+        <w:t>Working draft, revision 8 (amended later on 18 October 2026) • 18 October 2026 • Independent portfolio project</w:t>
       </w:r>
     </w:p>
     <w:p>
@@ -1120,7 +1120,7 @@
         <w:pStyle w:val="ListBullet"/>
       </w:pPr>
       <w:r>
-        <w:t>Read trace and composition check (exploratory, development pool only; 17 October 2026; not registered beforehand and not part of the benchmark metrics): every development read was also mapped with minimap2 to the D6331 reference genomes, which gives each read a label independent of Kraken2, and the label was crossed with the Kraken2 result for the same read. Of 185,000 reads, 90.05% mapped to one species. The mapped reads already depart from the theoretical composition: Roseburia hominis 0.42 of the expected reads, Limosilactobacillus fermentum 1.71 and Faecalibacterium prausnitzii 1.26. Kraken2 recovers 94 to 96% of the reads that map to these species and reproduces the departures (observed over mapped reads 0.98 to 0.99 with PlusPF-8). Its own loss is confined to species with close relatives: Escherichia coli (35% of its reads stop at family level) and Bifidobacterium adolescentis (53% stop at genus level and only 4% go to named sister species). For these two, observed over mapped reads rises from 0.62 to 0.94 and from 0.44 to 0.72 between the 8 GB and the full index, so the cap does matter for them. Bray–Curtis against the composition measured by mapping is 0.065, 0.048 and 0.022 for the 8 GB, 16 GB and full indexes (against the theoretical composition: 0.165, 0.150 and 0.131 recomputed, 0.166, 0.152 and 0.136 as registered). The registered D17 verdict is unchanged, but its rule compared reads with the theoretical composition and so mixed the composition of the sequenced sample with classifier error: the differences from the theoretical abundances should be read mainly as a property of this sequenced sample (or of its library preparation) and only partly as a property of the classifier. The lot certificate of analysis would help to separate these. Of the roughly 923 development reads called human at species rank, 825 are on reads that match none of the mock genomes (consistent with real human DNA, not proved). Caveats: mapping is a proxy for truth and depends on the reference genomes being close to the sequenced strains (both yeast references are drafts, so Candida albicans is undercounted by mapping); the mapping-based composition was defined after seeing results; one run, one pool.</w:t>
+        <w:t>Read trace and composition check (exploratory, development pool only; 17 October 2026; not registered beforehand and not part of the benchmark metrics): every development read was also mapped with minimap2 to the D6331 reference genomes, which gives each read a label independent of Kraken2, and the label was crossed with the Kraken2 result for the same read. Of 185,000 reads, 90.05% mapped to one species. The mapped reads already depart from the theoretical composition: Roseburia hominis 0.42 of the expected reads, Limosilactobacillus fermentum 1.71 and Faecalibacterium prausnitzii 1.26. Kraken2 recovers 94 to 96% of the reads that map to these species and reproduces the departures (observed over mapped reads 0.98 to 0.99 with PlusPF-8). Its own loss is confined to species with close relatives: Escherichia coli (35% of its reads stop at family level) and Bifidobacterium adolescentis (53% stop at genus level and only 4% go to named sister species). For these two, observed over mapped reads rises from 0.62 to 0.94 and from 0.44 to 0.72 between the 8 GB and the full index, so the cap does matter for them. Bray–Curtis against the composition measured by mapping is 0.065, 0.048 and 0.022 for the 8 GB, 16 GB and full indexes (against the theoretical composition: 0.165, 0.150 and 0.131 recomputed, 0.166, 0.152 and 0.136 as registered). The registered D17 verdict is unchanged, but its rule compared reads with the theoretical composition and so mixed the composition of the sequenced sample with classifier error: the differences from the theoretical abundances should be read mainly as a property of this sequenced sample (or of its library preparation) and only partly as a property of the classifier. The lot certificate of analysis would help to separate these. Of the roughly 923 development reads called human at species rank, 825 are on reads that match none of the mock genomes (consistent with real human DNA, not proved). Caveats: mapping is a proxy for truth and depends on the reference genomes being close to the sequenced strains (both yeast references are drafts, so Candida albicans is undercounted by mapping); the mapping-based composition was defined after seeing results; one run, one pool. Addendum (18 October 2026): the species also differ in mean read length (about 1.9 kb for Limosilactobacillus fermentum to about 8 kb), so read shares are not shares of DNA mass; the read-based figures above are unchanged but must be read with that in mind (see the Sylph abundance diagnostic below).</w:t>
       </w:r>
     </w:p>
     <w:p>
@@ -1134,7 +1134,7 @@
         <w:t xml:space="preserve">Sylph arm (D18; registered 17 October 2026, tag sylph-registered; Addendum A1 written 18 October 2026, after the development read profiles had been seen; held-out pool scored once per arm, tag sylph-eval-scored): </w:t>
       </w:r>
       <w:r>
-        <w:t xml:space="preserve">Sylph 1.0.0 with GTDB release 232 (two-stage database, 20 GB) and the RefSeq fungal database of 2024-07-25 estimates which genomes are present by k-mer containment instead of classifying reads one by one. The comparison is therefore between profiling configurations (reference collection, taxonomy and algorithm all differ from Kraken2 with PlusPF), not between algorithms alone. A profile takes about 4 seconds and 2.5 GiB, so no cloud machine was needed. The registered crosswalk from mock species to GTDB names (built by profiling the reference genomes as if they were reads) failed on the development pool: at the very low coverage of a single genome several database species tie at 100% ANI, the rule picked one arbitrarily, and F1 was 0.50 for a naming reason. Addendum A1 replaced it with genome-to-genome fastANI using the GTDB species criterion (ANI at least 95 over at least half of the genome); version 1 is kept unchanged and reported beside version 2. A gap rule applying the same fixed test to any genome first appearing in the evaluation profile was committed before that profile existed and added nothing. Held-out pool, arms 3a (defaults), 3b (effective-coverage filter; the cutoff chosen on the development pool was 0, so identical to 3a) and 3c (-u, exploratory) gave identical results: 13 of 13 called species correct, 0 false positives, 13 of 14 evaluable species detected (missed: Saccharomyces cerevisiae, for which the database holds no genome that passes the species test), F1 0.963, Bray–Curtis 0.249 against the theoretical DNA composition (0.242 among called mock species; Kraken2 on the same pool 0.132 with full PlusPF and 0.167 with PlusPF-8). Registered question: Bifidobacterium adolescentis observed over expected on a share basis (Sylph without -u reports relative shares, not read counts, so the Kraken2 comparators were recomputed on the same basis) was 0.495 for Sylph, 0.393 for PlusPF-full and 0.266 for PlusPF-8. The written rule (comparator plus 0.10 = 0.493, evaluable recall at least 13/14, at most 2 false positives) is met, by 0.002; the originally written literal 0.46 is also exceeded. That margin is very likely within noise (not measured for this number; the practice pool missed the same test by 0.003), so the result is reported as met but marginal. Abundance is worse than with Kraken2 overall: Escherichia coli 2.38, Roseburia hominis 0.30, Limosilactobacillus fermentum 0.49, Faecalibacterium prausnitzii 0.61 (cause not investigated). Of the registered expectations, detection and false positives held and B. adolescentis fell in its predicted range, while the Roseburia, L. fermentum and Bray–Curtis expectations were contradicted (E. coli met its criterion only because it was over-counted). With crosswalk version 1 the same profile scores F1 0.50 with 7 false positives, which shows that the result depends on how names are mapped. The held-out pool had been examined in earlier experiments, so this is a prospectively specified follow-up, not fresh validation.</w:t>
+        <w:t>Sylph 1.0.0 with GTDB release 232 (two-stage database, 20 GB) and the RefSeq fungal database of 2024-07-25 estimates which genomes are present by k-mer containment instead of classifying reads one by one. The comparison is therefore between profiling configurations (reference collection, taxonomy and algorithm all differ from Kraken2 with PlusPF), not between algorithms alone. A profile takes about 4 seconds and 2.5 GiB, so no cloud machine was needed. The registered crosswalk from mock species to GTDB names (built by profiling the reference genomes as if they were reads) failed on the development pool: at the very low coverage of a single genome several database species tie at 100% ANI, the rule picked one arbitrarily, and F1 was 0.50 for a naming reason. Addendum A1 replaced it with genome-to-genome fastANI using the GTDB species criterion (ANI at least 95 over at least half of the genome); version 1 is kept unchanged and reported beside version 2. A gap rule applying the same fixed test to any genome first appearing in the evaluation profile was committed before that profile existed and added nothing. Held-out pool, arms 3a (defaults), 3b (effective-coverage filter; the cutoff chosen on the development pool was 0, so identical to 3a) and 3c (-u, exploratory) gave identical results: 13 of 13 called species correct, 0 false positives, 13 of 14 evaluable species detected (missed: Saccharomyces cerevisiae, for which the database holds no genome that passes the species test), F1 0.963, Bray–Curtis 0.249 against the theoretical DNA composition (0.242 among called mock species; Kraken2 on the same pool 0.132 with full PlusPF and 0.167 with PlusPF-8). Registered question: Bifidobacterium adolescentis observed over expected on a share basis (Sylph without -u reports relative shares, not read counts, so the Kraken2 comparators were recomputed on the same basis) was 0.495 for Sylph, 0.393 for PlusPF-full and 0.266 for PlusPF-8. The written rule (comparator plus 0.10 = 0.493, evaluable recall at least 13/14, at most 2 false positives) is met, by 0.002; the originally written literal 0.46 is also exceeded. That margin is very likely within noise (not measured for this number; the practice pool missed the same test by 0.003), so the result is reported as met but marginal. Abundance is worse than with Kraken2 overall: Escherichia coli 2.38, Roseburia hominis 0.30, Limosilactobacillus fermentum 0.49, Faecalibacterium prausnitzii 0.61 (diagnosed afterwards on the development pool; see the Sylph abundance diagnostic below). Of the registered expectations, detection and false positives held and B. adolescentis fell in its predicted range, while the Roseburia, L. fermentum and Bray–Curtis expectations were contradicted (E. coli met its criterion only because it was over-counted). With crosswalk version 1 the same profile scores F1 0.50 with 7 false positives, which shows that the result depends on how names are mapped. The held-out pool had been examined in earlier experiments, so this is a prospectively specified follow-up, not fresh validation.</w:t>
       </w:r>
     </w:p>
     <w:p>
@@ -1149,6 +1149,20 @@
       </w:r>
       <w:r>
         <w:t xml:space="preserve">the paper that produced the dataset (Chen et al., Nature Communications 16:1744, 2025, doi 10.1038/s41467-025-57088-y) states PromethION, Kit 14 and Dorado v7.2.13 and cites PRJNA1181840, which confirms the ENA record; neither it nor its supplement gives the lot number, extraction method or model tier (the study authors have been asked). Its Supplementary Fig. S4 independently renames Fusobacterium nucleatum to Fusobacterium animalis for D6331, as in D13, and takes expected genome copies from minimap2 mapping of the reads. It also reports that Sylph version 0.6.1, with and without -u, underestimated species-level genome copies for nanopore samples (an older version, a coverage-based quantity rather than the shares scored here, and different sample statistics, so it supports caution about -u rather than explaining our results).</w:t>
+      </w:r>
+    </w:p>
+    <w:p>
+      <w:pPr>
+        <w:pStyle w:val="ListBullet"/>
+      </w:pPr>
+      <w:r>
+        <w:rPr>
+          <w:b/>
+        </w:rPr>
+        <w:t xml:space="preserve">Sylph abundance diagnostic (exploratory, development pool only; 18 October 2026; not a registered arm and part of no verdict; scripts bin/14 to bin/17, outputs in reports/sylph/dev_diagnostic and reports/kraken_bases): </w:t>
+      </w:r>
+      <w:r>
+        <w:t xml:space="preserve">Escherichia coli: the sample’s five strains are not in GTDB and each is about 96 to 97% ANI to several database genomes; Sylph reported three E. coli genomes, each carrying roughly the whole E. coli coverage (25.0, 24.0 and 15.3 against about 29 expected), with 6,704 and 6,529 k-mers reassigned between two of them, so the registered rule (sum over a mock species’ genome rows) counted the same reads about 2.5 times; keeping only the best-covered genome per species (post hoc what-if) gives 1.15 instead of 2.34 and Bray–Curtis among called mock species 0.182 instead of 0.240. Limosilactobacillus fermentum: the hypothesis written and committed before its first run (read errors reduce intact 31-mers, so error-rich species show lower effective coverage) was refuted: mean read identity was 90.2 to 93.6% in all 13 species, rho 0.23 between 31-mer survival and Sylph over mapped coverage (required at least 0.6), identity gap under 1 point (about 4 needed). The cause was read length, found post hoc in the same table: mean read length is 1.9 kb for L. fermentum, 3.1 kb for F. prausnitzii, 4.3 kb for Roseburia and Fusobacterium and 6 to 8 kb for the others, and the earlier calculation had assumed the pool mean (5,491 bp) for every species. With each species’ own length, Sylph’s True_cov divided by coverage from the assigned bases has median 1.05 (0.97 to 1.32) and Eff_cov divided by coverage 0.78 (0.72 to 0.97): Sylph tracks the DNA actually sequenced, and the manufacturer’s composition is a share of DNA mass. In bases L. fermentum is about 0.65 of its nominal share (1.89 in read shares). Kraken2 recounted in bases (same calls and threshold, bin/17): Bray–Curtis 0.166 on reads, 0.191 on bases; L. fermentum 1.99 to 0.69, F. prausnitzii 1.47 to 0.81, Roseburia 0.50 to 0.38; the gap to Sylph (0.240) shrinks from 0.075 to 0.051, so Kraken2 stays ahead on abundance by a smaller margin. Caveats: Kraken2’s species-level reads are longer than the reads that map to the same species (for example E. coli 9,365 against 7,256 bp), so its base shares carry a length bias; read length is the full read; the Sylph and Kraken2 species sets differ (13 and 14 mock species); one sample. Why species differ in read length (extraction, library preparation or the sample) is unresolved. The registered verdicts are unchanged.</w:t>
       </w:r>
     </w:p>
     <w:p>
@@ -1988,6 +2002,20 @@
         <w:pStyle w:val="ListBullet"/>
       </w:pPr>
       <w:r>
+        <w:rPr>
+          <w:b/>
+        </w:rPr>
+        <w:t xml:space="preserve">Reads are not DNA mass: </w:t>
+      </w:r>
+      <w:r>
+        <w:t xml:space="preserve">a manufacturer’s composition is a share of DNA, but a classifier counts reads, and species with shorter fragments yield more reads per unit of DNA (here 1.9 kb against 7 to 8 kb). Check the distribution of read length by species before interpreting abundance, and compare tools on the same basis (bases or coverage).</w:t>
+      </w:r>
+    </w:p>
+    <w:p>
+      <w:pPr>
+        <w:pStyle w:val="ListBullet"/>
+      </w:pPr>
+      <w:r>
         <w:t xml:space="preserve">Scope creep: finish the baseline benchmark before adding further classifiers, databases, clinical datasets or dashboards.</w:t>
       </w:r>
     </w:p>
@@ -2126,7 +2154,7 @@
         <w:pStyle w:val="ListBullet"/>
       </w:pPr>
       <w:r>
-        <w:t xml:space="preserve">18 October 2026, revision 8: Sylph arm (D18) registered, run and scored once per arm on the held-out pool, with Addendum A1 (crosswalk version 2 by fastANI, like-for-like verdict basis, gap rule) disclosed as written after the development read profiles; result added to Section 6; verdict on B. adolescentis met but marginal, abundance worse than Kraken2; Phase 2 status, open questions and risks updated; “the tube” replaced by “the sequenced sample” where the sequenced material is meant.</w:t>
+        <w:t>18 October 2026, revision 8: Sylph arm (D18) registered, run and scored once per arm on the held-out pool, with Addendum A1 (crosswalk version 2 by fastANI, like-for-like verdict basis, gap rule) disclosed as written after the development read profiles; result added to Section 6; verdict on B. adolescentis met but marginal, abundance worse than Kraken2; Phase 2 status, open questions and risks updated; “the tube” replaced by “the sequenced sample” where the sequenced material is meant. Amended later on 18 October 2026: the Sylph abundance diagnostic (E. coli shared reads; read-error hypothesis refuted; read-length effect, found post hoc; Kraken2 recounted in bases) added to Section 6, with a new risk about reads versus DNA mass; the earlier “cause not investigated” removed.</w:t>
       </w:r>
     </w:p>
     <w:sectPr>

</xml_diff>

<commit_message>
Plan Rev8 and Guide v5: add Addendum A2 result (reads versus bases, evaluation pool)
</commit_message>
<xml_diff>
--- a/docs/Nanopore_Metagenomics_Project_Plan_Rev8.docx
+++ b/docs/Nanopore_Metagenomics_Project_Plan_Rev8.docx
@@ -1167,6 +1167,20 @@
     </w:p>
     <w:p>
       <w:pPr>
+        <w:pStyle w:val="ListBullet"/>
+      </w:pPr>
+      <w:r>
+        <w:rPr>
+          <w:b/>
+        </w:rPr>
+        <w:t xml:space="preserve">Addendum A2 (D19; registered 18 October 2026 before any evaluation run, tag bases-registered; evaluation pool run once, tag bases-eval-scored): </w:t>
+      </w:r>
+      <w:r>
+        <w:t xml:space="preserve">the two dev findings were tested on the held-out pool with predictions fixed from dev numbers. Part A recounted the existing Kraken2 PlusPF-8 classification (confidence 0, frozen threshold 0.0008) in bases instead of reads; Part B applied a fixed best-genome rule (keep, for each mock species, the genome row with the largest effective coverage) to the Sylph arm 3a profile. All eight written predictions were met. Kraken2 Bray–Curtis rose from 0.168 (reads) to 0.191 (bases); Limosilactobacillus fermentum fell from 1.98 to 0.68 times its expected share, Faecalibacterium prausnitzii from 1.48 to 0.81, Roseburia hominis from 0.49 to 0.38. The mean read length of the reads assigned to each species repeated the development values (eval over dev 0.98 to 1.01 for 13 of 14 species; L. fermentum 1,997 bp). For Sylph the registered sum rule reproduced 0.249 and 0.242 and the best-genome rule gave 0.190 and 0.182, with Escherichia coli falling from 2.38 to 1.17 (three genome rows; every other species one). Sylph with the best-genome rule (0.182) and Kraken2 in bases (0.190) are within 0.01 of each other, and the registered Sylph sum rule stays worse (0.242). The registered verdicts are unchanged and the B. adolescentis verdict stays “met, marginal”; the best-genome rule raises every other species’ share, so its B. adolescentis value is not independent evidence. Limits: both pools come from one run, so this is a within-run replication and not evidence for another library or chemistry; the full-index and 16 GB Kraken2 classifications were not kept, so their base-share view is not covered; the species sets of the two tools differ.</w:t>
+      </w:r>
+    </w:p>
+    <w:p>
+      <w:pPr>
         <w:pStyle w:val="Heading2"/>
       </w:pPr>
       <w:r>
@@ -2154,7 +2168,7 @@
         <w:pStyle w:val="ListBullet"/>
       </w:pPr>
       <w:r>
-        <w:t>18 October 2026, revision 8: Sylph arm (D18) registered, run and scored once per arm on the held-out pool, with Addendum A1 (crosswalk version 2 by fastANI, like-for-like verdict basis, gap rule) disclosed as written after the development read profiles; result added to Section 6; verdict on B. adolescentis met but marginal, abundance worse than Kraken2; Phase 2 status, open questions and risks updated; “the tube” replaced by “the sequenced sample” where the sequenced material is meant. Amended later on 18 October 2026: the Sylph abundance diagnostic (E. coli shared reads; read-error hypothesis refuted; read-length effect, found post hoc; Kraken2 recounted in bases) added to Section 6, with a new risk about reads versus DNA mass; the earlier “cause not investigated” removed.</w:t>
+        <w:t>18 October 2026, revision 8: Sylph arm (D18) registered, run and scored once per arm on the held-out pool, with Addendum A1 (crosswalk version 2 by fastANI, like-for-like verdict basis, gap rule) disclosed as written after the development read profiles; result added to Section 6; verdict on B. adolescentis met but marginal, abundance worse than Kraken2; Phase 2 status, open questions and risks updated; “the tube” replaced by “the sequenced sample” where the sequenced material is meant. Amended later on 18 October 2026: the Sylph abundance diagnostic (E. coli shared reads; read-error hypothesis refuted; read-length effect, found post hoc; Kraken2 recounted in bases) added to Section 6, with a new risk about reads versus DNA mass; the earlier “cause not investigated” removed. Addendum A2 (reads versus bases on the held-out pool; all eight predictions met) added to Section 6.</w:t>
       </w:r>
     </w:p>
     <w:sectPr>

</xml_diff>